<commit_message>
fix(report): correct prose inconsistencies in SHAP narrative and minor text errors
- Exec summary + 9.2/9.4/E1: SHAP dominant features are chg_0 and hir_chg (momentum
  and cross-market), not staleness features; no staleness feature in top-8 by mean|SHAP|
- Fig 2 caption: right-skewed not left-skewed (2021-22 spike pulls upper tail)
- Sec 3.2: 287 of 1,155 training observations (was 1,153 from formula rounding)
- Sec 6.5: replaced speculative bullets with actual results (negative test skill,
  XGB and LightGBM significantly worse than RW at h=7, SARIMAX near RW at h=1)
- Exec summary directional accuracy: 57-62% (RF 56.7% to SARIMAX 61.9%)
- Sec 9.5: DL explainability remark updated to match corrected SHAP narrative
Report regenerated: Statistical_Report.docx and .pdf updated. 150 tests pass.

Co-Authored-By: Claude Sonnet 4.6 <noreply@anthropic.com>
</commit_message>
<xml_diff>
--- a/Statistical_Report.docx
+++ b/Statistical_Report.docx
@@ -138,12 +138,12 @@
     </w:p>
     <w:p>
       <w:r>
-        <w:t>The best point estimate is a modest +1.0% RMSE skill score at h = 1 (LSTM, test set), but this is within the range of statistical noise given the 247-row test series. A faint directional signal (~57–60% accuracy on genuine-move days at h = 1) is detectable but does not translate into a meaningful reduction in forecast error.</w:t>
+        <w:t>The best point estimate is a modest +1.0% RMSE skill score at h = 1 (LSTM, test set), but this is within the range of statistical noise given the 247-row test series. A faint directional signal (~57–62% accuracy on genuine-move days at h = 1, ranging from RF at 56.7% to SARIMAX at 61.9%) is detectable but does not translate into a meaningful reduction in forecast error.</w:t>
       </w:r>
     </w:p>
     <w:p>
       <w:r>
-        <w:t>SHAP analysis of the best tree model (Random Forest, h = 1) reveals that the model primarily learns to detect market staleness — whether the market is actively trading or carrying forward the previous day's price. In the training data, 75% of days are stale (zero price change); the random walk also predicts zero change every day, so the model gains nothing over the baseline on stale days and cannot compensate on the fewer genuine-move days.</w:t>
+        <w:t>SHAP analysis of the best tree model (Random Forest, h = 1) identifies the dominant drivers as recent realised momentum (chg_0, the most-recent daily change) and the HIR cross-market price change (hir_chg), followed by chg_1 — a lagged change that partly reflects the forward-fill artefact — and volume/volatility metrics. No staleness feature (price_moved, days_since_last_move, moves_7d/30d) appears in the top 8. These signals are real but weak: they are insufficient to consistently generate lower forecast error than simply carrying today's price forward.</w:t>
       </w:r>
     </w:p>
     <w:p>
@@ -368,7 +368,7 @@
           <w:i/>
           <w:sz w:val="18"/>
         </w:rPr>
-        <w:t>Figure 2.  Price distribution by split (violin plot, left; overlaid histogram, right). The training distribution is wide and left-skewed due to the 2021-22 spike; validation and test occupy a narrower high-price regime.</w:t>
+        <w:t>Figure 2.  Price distribution by split (violin plot, left; overlaid histogram, right). The training distribution is wide and right-skewed due to the 2021-22 price spike pulling the upper tail; validation and test occupy a narrower high-price regime.</w:t>
       </w:r>
     </w:p>
     <w:p>
@@ -461,7 +461,7 @@
     </w:p>
     <w:p>
       <w:r>
-        <w:t>A critical but initially non-obvious feature of this market is its extreme illiquidity. The data source records one row per calendar day, but genuine price-discovery events — days on which at least one trade executes — are rare. On 75.1% of training-set days, the price does not change at all from the previous observation. The corresponding figures are 59.1% for the validation set and 45.7% for the test set. Only 287 of 1,153 training observations represent genuine price moves.</w:t>
+        <w:t>A critical but initially non-obvious feature of this market is its extreme illiquidity. The data source records one row per calendar day, but genuine price-discovery events — days on which at least one trade executes — are rare. On 75.1% of training-set days, the price does not change at all from the previous observation. The corresponding figures are 59.1% for the validation set and 45.7% for the test set. Only 287 of 1,155 training observations represent genuine price moves.</w:t>
       </w:r>
     </w:p>
     <w:p>
@@ -3864,7 +3864,7 @@
         <w:pStyle w:val="ListBullet"/>
       </w:pPr>
       <w:r>
-        <w:t>The 25-feature matrix was designed to capture momentum (chg_0 as the lag-1 carrier), staleness structure, and volatility regime. If tree models achieve modest positive skill, this is the expected source. Negative skill at longer horizons (h=30) would be unsurprising: the 30-day-ahead change distribution is much wider and the mean-reversion implied by the random-walk null is genuinely hard to beat.</w:t>
+        <w:t>Tree model performance on the test set: all three tree models (RF, XGB, LightGBM) show negative or negligible skill at h = 1 and deteriorate further at h = 7 and h = 30. XGB and LightGBM are significantly worse than the random walk at h = 7 (positive DM stat, p &lt; 0.05). The 25-feature matrix captures momentum (chg_0) and staleness structure, but these signals are insufficient to overcome the near-efficient, event-driven price dynamics.</w:t>
       </w:r>
     </w:p>
     <w:p>
@@ -3872,7 +3872,7 @@
         <w:pStyle w:val="ListBullet"/>
       </w:pPr>
       <w:r>
-        <w:t>SARIMAX serves as a sanity check. Because the price change series has minimal linear autocorrelation (Section 3.3) and the model ignores all exogenous features, it is expected to perform close to or worse than the random walk at most horizons.</w:t>
+        <w:t>SARIMAX(1,1,1) result: close to but not significantly better than the random walk at h = 1 (skill ≈ +0.5%), and worse at longer horizons. Because the daily price-change series has minimal linear autocorrelation (Section 3.3) and SARIMAX ignores all exogenous features, this result is the expected confirmation that linear AR/MA structure alone carries no forecasting value here.</w:t>
       </w:r>
     </w:p>
     <w:p>
@@ -7779,7 +7779,7 @@
     </w:p>
     <w:p>
       <w:r>
-        <w:t>Figure E1 shows the feature importance ranking. Three feature groups dominate:</w:t>
+        <w:t>Table 6 and Figure E1 show the feature importance ranking. The top features are:</w:t>
       </w:r>
     </w:p>
     <w:p>
@@ -7787,7 +7787,7 @@
         <w:pStyle w:val="ListBullet"/>
       </w:pPr>
       <w:r>
-        <w:t>Staleness features (days_since_last_move, price_moved, moves_7d/30d): the model devotes significant capacity to detecting whether the market is in a stale or active regime. In the training data, 75% of days have zero price change, so regime identification is the single largest source of predictable structure.</w:t>
+        <w:t>chg_0 (mean |SHAP| = 0.023 A$/tonne) — the most-recent realised daily price change. This is the primary momentum carrier identified in the ACF analysis (Section 3.3): a genuine lag-1 signal on active-trading days.</w:t>
       </w:r>
     </w:p>
     <w:p>
@@ -7795,7 +7795,7 @@
         <w:pStyle w:val="ListBullet"/>
       </w:pPr>
       <w:r>
-        <w:t>Recent momentum (chg_0 = most-recent day's change): the last realised price change carries staleness information — a non-zero chg_0 signals that the market was active yesterday. This feature is the primary momentum carrier identified in the Block B ACF analysis.</w:t>
+        <w:t>hir_chg (0.020) — the first difference of the HIR (Human-Induced Regeneration) ACCU price. HIR and Generic prices trade in the same market; co-movement of their daily changes provides a cross-market confirmation signal.</w:t>
       </w:r>
     </w:p>
     <w:p>
@@ -7803,7 +7803,28 @@
         <w:pStyle w:val="ListBullet"/>
       </w:pPr>
       <w:r>
-        <w:t>Lagged change chg_1 (and chg_2, chg_3): modest but non-negligible importance, partly for genuine momentum persistence but partly via the forward-fill artefact discussed in Section 9.3.</w:t>
+        <w:t>chg_1 (0.020) — the lagged change at t−2. This carries a mix of genuine short-run momentum persistence and the forward-fill artefact discussed in Section 9.3.</w:t>
+      </w:r>
+    </w:p>
+    <w:p>
+      <w:pPr>
+        <w:pStyle w:val="ListBullet"/>
+      </w:pPr>
+      <w:r>
+        <w:t>hir_vol_trail7 (0.012), vol_generic_trail7 (0.008), vol_chg_7d (0.004) — trailing volume and volatility metrics. These proxy for market activity and liquidity-regime context.</w:t>
+      </w:r>
+    </w:p>
+    <w:p>
+      <w:pPr>
+        <w:pStyle w:val="ListBullet"/>
+      </w:pPr>
+      <w:r>
+        <w:t>chg_5 (0.008) and month (0.004) — a longer-lag momentum feature and a calendar seasonality signal.</w:t>
+      </w:r>
+    </w:p>
+    <w:p>
+      <w:r>
+        <w:t>Notably, no staleness feature (price_moved, days_since_last_move, moves_7d, moves_30d) appears in the top 8. The model's dominant signals are momentum and cross-market co-movement — not regime classification per se. However, these signals are weak in magnitude (largest mean |SHAP| = 0.023 A$/tonne vs a random-walk RMSE of 0.32 A$/tonne on the test set) and insufficient to consistently beat the random-walk baseline.</w:t>
       </w:r>
     </w:p>
     <w:p/>
@@ -8082,7 +8103,7 @@
           <w:i/>
           <w:sz w:val="18"/>
         </w:rPr>
-        <w:t>Figure E1.  Feature importance for Random Forest (h = 1, test set) ranked by mean |SHAP| value. Red bars = momentum lag features (chg_*); green = staleness features; blue = volatility, volume, exogenous, calendar. The model relies primarily on staleness structure and recent-change information rather than multi-day momentum.</w:t>
+        <w:t>Figure E1.  Feature importance for Random Forest (h = 1, test set) ranked by mean |SHAP| value. Red bars = momentum lag features (chg_*); green = staleness features; blue = volatility, volume, exogenous, calendar. The dominant drivers are chg_0 (recent momentum) and hir_chg (HIR cross-market change), with volume/volatility metrics in the mid-range. No staleness feature appears in the top 8.</w:t>
       </w:r>
     </w:p>
     <w:p>
@@ -8191,7 +8212,7 @@
         <w:pStyle w:val="ListBullet"/>
       </w:pPr>
       <w:r>
-        <w:t>The model has learned to identify stale vs active regimes (via staleness features and chg_0), and in stale regimes it correctly predicts near-zero change. But the random walk also predicts zero change on every day — so the model gains nothing on stale days relative to the baseline.</w:t>
+        <w:t>The top SHAP features — chg_0, hir_chg, chg_1 — are all short-lag momentum and cross-market signals. These carry genuine information about the direction and magnitude of recent price moves. On stale days (~46% of test), both the model and the random walk predict near-zero change; the model offers no advantage here.</w:t>
       </w:r>
     </w:p>
     <w:p>
@@ -8199,7 +8220,7 @@
         <w:pStyle w:val="ListBullet"/>
       </w:pPr>
       <w:r>
-        <w:t>On genuine-move days (where skill would matter most), the model's directional accuracy is only ~57%, barely above the 50% random threshold. The SHAP values on these days are driven by regime-detection features, not directional price signals.</w:t>
+        <w:t>On genuine-move days (where skill would matter most), the model's directional accuracy is ~57–62% (Section 8.3), marginally above the 50% random threshold. The momentum and cross-market signals are real but do not produce large enough SHAP magnitudes (max 0.023 A$/tonne) to dominate the residual error on these high-variance days.</w:t>
       </w:r>
     </w:p>
     <w:p>
@@ -8207,7 +8228,7 @@
         <w:pStyle w:val="ListBullet"/>
       </w:pPr>
       <w:r>
-        <w:t>The implication for longer horizons (h=7, 30) is direct: staleness autocorrelation decays quickly (Section 3.3), so regime-detection features become less reliable, and the model reverts to roughly zero-prediction behaviour — matching the random walk but without consistently beating it.</w:t>
+        <w:t>The implication for longer horizons (h = 7, 30) is direct: short-lag momentum (chg_0, chg_1) decays within one to two steps, and the cross-market HIR co-movement also becomes less predictable. At longer horizons the model reverts toward zero-change prediction — matching the random walk without consistently beating it.</w:t>
       </w:r>
     </w:p>
     <w:p>
@@ -8220,7 +8241,7 @@
     </w:p>
     <w:p>
       <w:r>
-        <w:t>SHAP TreeExplainer is not directly applicable to the recurrent architectures (LSTM, GRU) trained in Section 7. Gradient-based methods (Integrated Gradients, GradCAM) or SHAP KernelExplainer (model-agnostic, slow) could be applied, but given that both DL models fail to beat the random walk at any horizon, detailed explainability analysis would likely confirm the same regime-detection pattern observed in the RF: the networks learn to predict near-zero change on stale days (where the training loss is dominated by zero-target rows), contributing nothing beyond the RW baseline. This is a limitation acknowledged for future work.</w:t>
+        <w:t>SHAP TreeExplainer is not directly applicable to the recurrent architectures (LSTM, GRU) trained in Section 7. Gradient-based methods (Integrated Gradients, GradCAM) or SHAP KernelExplainer (model-agnostic, slow) could be applied, but given that both DL models fail to beat the random walk at any horizon, detailed attribution analysis would likely identify a similar pattern to the RF: short-lag momentum features (chg_0, chg_1) as primary drivers, with the network reverting to near-zero predictions on stale days where the training loss is dominated by zero-target rows. This is a limitation acknowledged for future work.</w:t>
       </w:r>
     </w:p>
     <w:p>

</xml_diff>

<commit_message>
fix(report): remove remaining staleness-dominates SHAP claims and fix row count
- Sec 11: SHAP sentence rewritten; top drivers are chg_0 and hir_chg, real but
  too weak vs RW RMSE 0.32; no staleness feature in top-8; regime-detection removed
- Fig 8 caption: lag momentum, volume, calendar dominate top correlations
- Sec 10.1: 1,155 rows not 1,125; consistent with cleaned training set
Report regenerated. 150 tests pass.

Co-Authored-By: Claude Sonnet 4.6 <noreply@anthropic.com>
</commit_message>
<xml_diff>
--- a/Statistical_Report.docx
+++ b/Statistical_Report.docx
@@ -1003,7 +1003,7 @@
           <w:i/>
           <w:sz w:val="18"/>
         </w:rPr>
-        <w:t>Figure 8.  Pearson correlations of each feature with the 1-day-ahead target (target_1) on the training set. Positive (red) bars indicate momentum-aligned features; negative (blue) bars indicate mean-reverting signals. The staleness and lag features dominate the top rankings.</w:t>
+        <w:t>Figure 8.  Pearson correlations of each feature with the 1-day-ahead target (target_1) on the training set. Positive (red) bars indicate momentum-aligned features; negative (blue) bars indicate mean-reverting signals. Lagged momentum changes (chg_1, chg_3, chg_5), volume metrics, and calendar features dominate the top correlation rankings.</w:t>
       </w:r>
     </w:p>
     <w:p>
@@ -8272,7 +8272,7 @@
     </w:p>
     <w:p>
       <w:r>
-        <w:t>The nominal training set contains 1,125 rows, but only approximately 287 of these are genuine price-discovery days (days with non-zero price change). Statistical learning on 287 informative observations is severely constrained: tree models cannot reliably learn interactions between more than a handful of features, and sequence models (LSTM, GRU) face an even more acute sample problem after windowing. The true signal-to-noise ratio is far lower than the raw row count suggests.</w:t>
+        <w:t>The cleaned training set contains 1,155 rows, but only approximately 287 of these are genuine price-discovery days (days with non-zero price change). Statistical learning on 287 informative observations is severely constrained: tree models cannot reliably learn interactions between more than a handful of features, and sequence models (LSTM, GRU) face an even more acute sample problem after windowing. The true signal-to-noise ratio is far lower than the raw row count suggests.</w:t>
       </w:r>
     </w:p>
     <w:p>
@@ -8426,7 +8426,7 @@
     </w:p>
     <w:p>
       <w:r>
-        <w:t>SHAP analysis of the best tree model revealed that the apparent marginal skill at h = 1 derives almost entirely from regime detection — identifying whether the market is in a stale (non-trading) or active state — rather than from genuine directional price forecasting. Because the random walk also predicts zero change on every day, the model gains nothing over the baseline on stale days, and its advantage on genuine-move days is insufficient to be statistically significant.</w:t>
+        <w:t>SHAP analysis of the best tree model (Random Forest, h = 1) identified the dominant drivers as short-lag momentum (chg_0, the most-recent daily change) and the HIR cross-market price change (hir_chg), with no staleness feature (price_moved, days_since_last_move, moves_7d/30d) appearing in the top 8 by mean absolute SHAP value. These momentum and cross-market signals are real, but their average impact (≤ 0.023 A$/tonne) is too small relative to the test-set random-walk RMSE (0.32 A$/tonne) to consistently produce lower forecast error than simply carrying today's price forward.</w:t>
       </w:r>
     </w:p>
     <w:p>

</xml_diff>